<commit_message>
Build P1 DOCX and sync index
</commit_message>
<xml_diff>
--- a/hw/P1.docx
+++ b/hw/P1.docx
@@ -4,18 +4,21 @@
   <w:body>
     <w:tbl>
       <w:tblPr>
-        <w:tblW w:type="auto" w:w="0"/>
+        <w:tblW w:type="dxa" w:w="9751"/>
         <w:jc w:val="center"/>
         <w:tblLayout w:type="fixed"/>
         <w:tblLook w:firstColumn="1" w:firstRow="1" w:lastColumn="0" w:lastRow="0" w:noHBand="0" w:noVBand="1" w:val="04A0"/>
       </w:tblPr>
       <w:tblGrid>
-        <w:gridCol w:w="10148"/>
+        <w:gridCol w:w="9751"/>
       </w:tblGrid>
       <w:tr>
+        <w:trPr>
+          <w:cantSplit/>
+        </w:trPr>
         <w:tc>
           <w:tcPr>
-            <w:tcW w:type="dxa" w:w="10148"/>
+            <w:tcW w:type="dxa" w:w="9751"/>
             <w:shd w:fill="0F172A"/>
             <w:tcMar>
               <w:top w:w="190" w:type="dxa"/>
@@ -61,20 +64,23 @@
     </w:p>
     <w:tbl>
       <w:tblPr>
-        <w:tblW w:type="auto" w:w="0"/>
+        <w:tblW w:type="dxa" w:w="9751"/>
         <w:jc w:val="center"/>
         <w:tblLayout w:type="fixed"/>
         <w:tblLook w:firstColumn="1" w:firstRow="1" w:lastColumn="0" w:lastRow="0" w:noHBand="0" w:noVBand="1" w:val="04A0"/>
       </w:tblPr>
       <w:tblGrid>
-        <w:gridCol w:w="3383"/>
-        <w:gridCol w:w="3383"/>
-        <w:gridCol w:w="3383"/>
+        <w:gridCol w:w="4479"/>
+        <w:gridCol w:w="2268"/>
+        <w:gridCol w:w="3005"/>
       </w:tblGrid>
       <w:tr>
+        <w:trPr>
+          <w:cantSplit/>
+        </w:trPr>
         <w:tc>
           <w:tcPr>
-            <w:tcW w:type="dxa" w:w="4706"/>
+            <w:tcW w:type="dxa" w:w="4479"/>
             <w:vAlign w:val="center"/>
             <w:tcMar>
               <w:top w:w="110" w:type="dxa"/>
@@ -99,19 +105,21 @@
           <w:p>
             <w:pPr>
               <w:spacing w:before="100" w:after="0"/>
+              <w:pBdr>
+                <w:bottom w:val="single" w:sz="6" w:space="1" w:color="94A3B8"/>
+              </w:pBdr>
             </w:pPr>
             <w:r>
               <w:rPr>
-                <w:color w:val="94A3B8"/>
                 <w:sz w:val="16"/>
               </w:rPr>
-              <w:t>____________________________</w:t>
+              <w:t xml:space="preserve"> </w:t>
             </w:r>
           </w:p>
         </w:tc>
         <w:tc>
           <w:tcPr>
-            <w:tcW w:type="dxa" w:w="2381"/>
+            <w:tcW w:type="dxa" w:w="2268"/>
             <w:vAlign w:val="center"/>
             <w:tcMar>
               <w:top w:w="110" w:type="dxa"/>
@@ -136,19 +144,21 @@
           <w:p>
             <w:pPr>
               <w:spacing w:before="100" w:after="0"/>
+              <w:pBdr>
+                <w:bottom w:val="single" w:sz="6" w:space="1" w:color="94A3B8"/>
+              </w:pBdr>
             </w:pPr>
             <w:r>
               <w:rPr>
-                <w:color w:val="94A3B8"/>
                 <w:sz w:val="16"/>
               </w:rPr>
-              <w:t>____________________________</w:t>
+              <w:t xml:space="preserve"> </w:t>
             </w:r>
           </w:p>
         </w:tc>
         <w:tc>
           <w:tcPr>
-            <w:tcW w:type="dxa" w:w="3061"/>
+            <w:tcW w:type="dxa" w:w="3005"/>
             <w:vAlign w:val="center"/>
             <w:tcMar>
               <w:top w:w="110" w:type="dxa"/>
@@ -173,13 +183,15 @@
           <w:p>
             <w:pPr>
               <w:spacing w:before="100" w:after="0"/>
+              <w:pBdr>
+                <w:bottom w:val="single" w:sz="6" w:space="1" w:color="94A3B8"/>
+              </w:pBdr>
             </w:pPr>
             <w:r>
               <w:rPr>
-                <w:color w:val="94A3B8"/>
                 <w:sz w:val="16"/>
               </w:rPr>
-              <w:t>____________________________</w:t>
+              <w:t xml:space="preserve"> </w:t>
             </w:r>
           </w:p>
         </w:tc>
@@ -187,20 +199,23 @@
     </w:tbl>
     <w:tbl>
       <w:tblPr>
-        <w:tblW w:type="auto" w:w="0"/>
+        <w:tblW w:type="dxa" w:w="9751"/>
         <w:jc w:val="center"/>
         <w:tblLayout w:type="fixed"/>
         <w:tblLook w:firstColumn="1" w:firstRow="1" w:lastColumn="0" w:lastRow="0" w:noHBand="0" w:noVBand="1" w:val="04A0"/>
       </w:tblPr>
       <w:tblGrid>
-        <w:gridCol w:w="3383"/>
-        <w:gridCol w:w="3383"/>
-        <w:gridCol w:w="3383"/>
+        <w:gridCol w:w="4479"/>
+        <w:gridCol w:w="2268"/>
+        <w:gridCol w:w="3005"/>
       </w:tblGrid>
       <w:tr>
+        <w:trPr>
+          <w:cantSplit/>
+        </w:trPr>
         <w:tc>
           <w:tcPr>
-            <w:tcW w:type="dxa" w:w="4706"/>
+            <w:tcW w:type="dxa" w:w="4479"/>
             <w:shd w:fill="EFF6FF"/>
             <w:tcMar>
               <w:top w:w="120" w:type="dxa"/>
@@ -240,7 +255,7 @@
         </w:tc>
         <w:tc>
           <w:tcPr>
-            <w:tcW w:type="dxa" w:w="2381"/>
+            <w:tcW w:type="dxa" w:w="2268"/>
             <w:shd w:fill="EFF6FF"/>
             <w:tcMar>
               <w:top w:w="120" w:type="dxa"/>
@@ -280,7 +295,7 @@
         </w:tc>
         <w:tc>
           <w:tcPr>
-            <w:tcW w:type="dxa" w:w="3061"/>
+            <w:tcW w:type="dxa" w:w="3005"/>
             <w:shd w:fill="ECFDF5"/>
             <w:tcMar>
               <w:top w:w="120" w:type="dxa"/>
@@ -335,23 +350,26 @@
     </w:p>
     <w:tbl>
       <w:tblPr>
-        <w:tblW w:type="auto" w:w="0"/>
+        <w:tblW w:type="dxa" w:w="9729"/>
         <w:jc w:val="center"/>
         <w:tblLayout w:type="fixed"/>
         <w:tblLook w:firstColumn="1" w:firstRow="1" w:lastColumn="0" w:lastRow="0" w:noHBand="0" w:noVBand="1" w:val="04A0"/>
       </w:tblPr>
       <w:tblGrid>
-        <w:gridCol w:w="1691"/>
-        <w:gridCol w:w="1691"/>
-        <w:gridCol w:w="1691"/>
-        <w:gridCol w:w="1691"/>
-        <w:gridCol w:w="1691"/>
-        <w:gridCol w:w="1691"/>
+        <w:gridCol w:w="1621"/>
+        <w:gridCol w:w="1621"/>
+        <w:gridCol w:w="1621"/>
+        <w:gridCol w:w="1621"/>
+        <w:gridCol w:w="1621"/>
+        <w:gridCol w:w="1621"/>
       </w:tblGrid>
       <w:tr>
+        <w:trPr>
+          <w:cantSplit/>
+        </w:trPr>
         <w:tc>
           <w:tcPr>
-            <w:tcW w:type="dxa" w:w="1672"/>
+            <w:tcW w:type="dxa" w:w="1621"/>
             <w:tcMar>
               <w:top w:w="65" w:type="dxa"/>
               <w:start w:w="50" w:type="dxa"/>
@@ -383,7 +401,7 @@
         </w:tc>
         <w:tc>
           <w:tcPr>
-            <w:tcW w:type="dxa" w:w="1672"/>
+            <w:tcW w:type="dxa" w:w="1621"/>
             <w:tcMar>
               <w:top w:w="65" w:type="dxa"/>
               <w:start w:w="50" w:type="dxa"/>
@@ -415,7 +433,7 @@
         </w:tc>
         <w:tc>
           <w:tcPr>
-            <w:tcW w:type="dxa" w:w="1672"/>
+            <w:tcW w:type="dxa" w:w="1621"/>
             <w:tcMar>
               <w:top w:w="65" w:type="dxa"/>
               <w:start w:w="50" w:type="dxa"/>
@@ -447,7 +465,7 @@
         </w:tc>
         <w:tc>
           <w:tcPr>
-            <w:tcW w:type="dxa" w:w="1672"/>
+            <w:tcW w:type="dxa" w:w="1621"/>
             <w:tcMar>
               <w:top w:w="65" w:type="dxa"/>
               <w:start w:w="50" w:type="dxa"/>
@@ -479,7 +497,7 @@
         </w:tc>
         <w:tc>
           <w:tcPr>
-            <w:tcW w:type="dxa" w:w="1672"/>
+            <w:tcW w:type="dxa" w:w="1621"/>
             <w:tcMar>
               <w:top w:w="65" w:type="dxa"/>
               <w:start w:w="50" w:type="dxa"/>
@@ -511,7 +529,7 @@
         </w:tc>
         <w:tc>
           <w:tcPr>
-            <w:tcW w:type="dxa" w:w="1672"/>
+            <w:tcW w:type="dxa" w:w="1621"/>
             <w:tcMar>
               <w:top w:w="65" w:type="dxa"/>
               <w:start w:w="50" w:type="dxa"/>
@@ -543,9 +561,12 @@
         </w:tc>
       </w:tr>
       <w:tr>
+        <w:trPr>
+          <w:cantSplit/>
+        </w:trPr>
         <w:tc>
           <w:tcPr>
-            <w:tcW w:type="dxa" w:w="1672"/>
+            <w:tcW w:type="dxa" w:w="1621"/>
             <w:tcMar>
               <w:top w:w="65" w:type="dxa"/>
               <w:start w:w="50" w:type="dxa"/>
@@ -576,7 +597,7 @@
         </w:tc>
         <w:tc>
           <w:tcPr>
-            <w:tcW w:type="dxa" w:w="1672"/>
+            <w:tcW w:type="dxa" w:w="1621"/>
             <w:tcMar>
               <w:top w:w="65" w:type="dxa"/>
               <w:start w:w="50" w:type="dxa"/>
@@ -607,7 +628,7 @@
         </w:tc>
         <w:tc>
           <w:tcPr>
-            <w:tcW w:type="dxa" w:w="1672"/>
+            <w:tcW w:type="dxa" w:w="1621"/>
             <w:tcMar>
               <w:top w:w="65" w:type="dxa"/>
               <w:start w:w="50" w:type="dxa"/>
@@ -638,7 +659,7 @@
         </w:tc>
         <w:tc>
           <w:tcPr>
-            <w:tcW w:type="dxa" w:w="1672"/>
+            <w:tcW w:type="dxa" w:w="1621"/>
             <w:tcMar>
               <w:top w:w="65" w:type="dxa"/>
               <w:start w:w="50" w:type="dxa"/>
@@ -669,7 +690,7 @@
         </w:tc>
         <w:tc>
           <w:tcPr>
-            <w:tcW w:type="dxa" w:w="1672"/>
+            <w:tcW w:type="dxa" w:w="1621"/>
             <w:tcMar>
               <w:top w:w="65" w:type="dxa"/>
               <w:start w:w="50" w:type="dxa"/>
@@ -700,7 +721,7 @@
         </w:tc>
         <w:tc>
           <w:tcPr>
-            <w:tcW w:type="dxa" w:w="1672"/>
+            <w:tcW w:type="dxa" w:w="1621"/>
             <w:tcMar>
               <w:top w:w="65" w:type="dxa"/>
               <w:start w:w="50" w:type="dxa"/>
@@ -1265,22 +1286,23 @@
     </w:p>
     <w:tbl>
       <w:tblPr>
-        <w:tblW w:type="auto" w:w="0"/>
+        <w:tblW w:type="dxa" w:w="9751"/>
         <w:jc w:val="center"/>
         <w:tblLayout w:type="fixed"/>
         <w:tblLook w:firstColumn="1" w:firstRow="1" w:lastColumn="0" w:lastRow="0" w:noHBand="0" w:noVBand="1" w:val="04A0"/>
       </w:tblPr>
       <w:tblGrid>
-        <w:gridCol w:w="8164"/>
-        <w:gridCol w:w="1928"/>
+        <w:gridCol w:w="7767"/>
+        <w:gridCol w:w="1984"/>
       </w:tblGrid>
       <w:tr>
         <w:trPr>
           <w:tblHeader w:val="true"/>
+          <w:cantSplit/>
         </w:trPr>
         <w:tc>
           <w:tcPr>
-            <w:tcW w:type="dxa" w:w="5074"/>
+            <w:tcW w:type="dxa" w:w="7767"/>
             <w:shd w:fill="0F172A"/>
             <w:tcMar>
               <w:top w:w="90" w:type="dxa"/>
@@ -1302,7 +1324,7 @@
         </w:tc>
         <w:tc>
           <w:tcPr>
-            <w:tcW w:type="dxa" w:w="5074"/>
+            <w:tcW w:type="dxa" w:w="1984"/>
             <w:shd w:fill="0F172A"/>
             <w:tcMar>
               <w:top w:w="90" w:type="dxa"/>
@@ -1324,9 +1346,12 @@
         </w:tc>
       </w:tr>
       <w:tr>
+        <w:trPr>
+          <w:cantSplit/>
+        </w:trPr>
         <w:tc>
           <w:tcPr>
-            <w:tcW w:type="dxa" w:w="8164"/>
+            <w:tcW w:type="dxa" w:w="7767"/>
             <w:tcMar>
               <w:top w:w="90" w:type="dxa"/>
               <w:start w:w="90" w:type="dxa"/>
@@ -1348,7 +1373,7 @@
         </w:tc>
         <w:tc>
           <w:tcPr>
-            <w:tcW w:type="dxa" w:w="1928"/>
+            <w:tcW w:type="dxa" w:w="1984"/>
             <w:tcMar>
               <w:top w:w="90" w:type="dxa"/>
               <w:start w:w="90" w:type="dxa"/>
@@ -1373,9 +1398,12 @@
         </w:tc>
       </w:tr>
       <w:tr>
+        <w:trPr>
+          <w:cantSplit/>
+        </w:trPr>
         <w:tc>
           <w:tcPr>
-            <w:tcW w:type="dxa" w:w="8164"/>
+            <w:tcW w:type="dxa" w:w="7767"/>
             <w:tcMar>
               <w:top w:w="90" w:type="dxa"/>
               <w:start w:w="90" w:type="dxa"/>
@@ -1397,7 +1425,7 @@
         </w:tc>
         <w:tc>
           <w:tcPr>
-            <w:tcW w:type="dxa" w:w="1928"/>
+            <w:tcW w:type="dxa" w:w="1984"/>
             <w:tcMar>
               <w:top w:w="90" w:type="dxa"/>
               <w:start w:w="90" w:type="dxa"/>
@@ -1422,9 +1450,12 @@
         </w:tc>
       </w:tr>
       <w:tr>
+        <w:trPr>
+          <w:cantSplit/>
+        </w:trPr>
         <w:tc>
           <w:tcPr>
-            <w:tcW w:type="dxa" w:w="8164"/>
+            <w:tcW w:type="dxa" w:w="7767"/>
             <w:tcMar>
               <w:top w:w="90" w:type="dxa"/>
               <w:start w:w="90" w:type="dxa"/>
@@ -1446,7 +1477,7 @@
         </w:tc>
         <w:tc>
           <w:tcPr>
-            <w:tcW w:type="dxa" w:w="1928"/>
+            <w:tcW w:type="dxa" w:w="1984"/>
             <w:tcMar>
               <w:top w:w="90" w:type="dxa"/>
               <w:start w:w="90" w:type="dxa"/>
@@ -1471,9 +1502,12 @@
         </w:tc>
       </w:tr>
       <w:tr>
+        <w:trPr>
+          <w:cantSplit/>
+        </w:trPr>
         <w:tc>
           <w:tcPr>
-            <w:tcW w:type="dxa" w:w="8164"/>
+            <w:tcW w:type="dxa" w:w="7767"/>
             <w:tcMar>
               <w:top w:w="90" w:type="dxa"/>
               <w:start w:w="90" w:type="dxa"/>
@@ -1495,7 +1529,7 @@
         </w:tc>
         <w:tc>
           <w:tcPr>
-            <w:tcW w:type="dxa" w:w="1928"/>
+            <w:tcW w:type="dxa" w:w="1984"/>
             <w:tcMar>
               <w:top w:w="90" w:type="dxa"/>
               <w:start w:w="90" w:type="dxa"/>
@@ -1520,9 +1554,12 @@
         </w:tc>
       </w:tr>
       <w:tr>
+        <w:trPr>
+          <w:cantSplit/>
+        </w:trPr>
         <w:tc>
           <w:tcPr>
-            <w:tcW w:type="dxa" w:w="8164"/>
+            <w:tcW w:type="dxa" w:w="7767"/>
             <w:tcMar>
               <w:top w:w="90" w:type="dxa"/>
               <w:start w:w="90" w:type="dxa"/>
@@ -1544,7 +1581,7 @@
         </w:tc>
         <w:tc>
           <w:tcPr>
-            <w:tcW w:type="dxa" w:w="1928"/>
+            <w:tcW w:type="dxa" w:w="1984"/>
             <w:tcMar>
               <w:top w:w="90" w:type="dxa"/>
               <w:start w:w="90" w:type="dxa"/>
@@ -1569,9 +1606,12 @@
         </w:tc>
       </w:tr>
       <w:tr>
+        <w:trPr>
+          <w:cantSplit/>
+        </w:trPr>
         <w:tc>
           <w:tcPr>
-            <w:tcW w:type="dxa" w:w="8164"/>
+            <w:tcW w:type="dxa" w:w="7767"/>
             <w:tcMar>
               <w:top w:w="90" w:type="dxa"/>
               <w:start w:w="90" w:type="dxa"/>
@@ -1593,7 +1633,7 @@
         </w:tc>
         <w:tc>
           <w:tcPr>
-            <w:tcW w:type="dxa" w:w="1928"/>
+            <w:tcW w:type="dxa" w:w="1984"/>
             <w:tcMar>
               <w:top w:w="90" w:type="dxa"/>
               <w:start w:w="90" w:type="dxa"/>
@@ -1652,50 +1692,46 @@
     </w:p>
     <w:p>
       <w:pPr>
+        <w:tabs>
+          <w:tab w:pos="9751" w:val="right" w:leader="underscore"/>
+        </w:tabs>
         <w:spacing w:after="60"/>
       </w:pPr>
       <w:r>
-        <w:rPr>
-          <w:color w:val="94A3B8"/>
-          <w:sz w:val="18"/>
-        </w:rPr>
-        <w:t>________________________________________________________________________________</w:t>
+        <w:tab/>
       </w:r>
     </w:p>
     <w:p>
       <w:pPr>
+        <w:tabs>
+          <w:tab w:pos="9751" w:val="right" w:leader="underscore"/>
+        </w:tabs>
         <w:spacing w:after="60"/>
       </w:pPr>
       <w:r>
-        <w:rPr>
-          <w:color w:val="94A3B8"/>
-          <w:sz w:val="18"/>
-        </w:rPr>
-        <w:t>________________________________________________________________________________</w:t>
+        <w:tab/>
       </w:r>
     </w:p>
     <w:p>
       <w:pPr>
+        <w:tabs>
+          <w:tab w:pos="9751" w:val="right" w:leader="underscore"/>
+        </w:tabs>
         <w:spacing w:after="60"/>
       </w:pPr>
       <w:r>
-        <w:rPr>
-          <w:color w:val="94A3B8"/>
-          <w:sz w:val="18"/>
-        </w:rPr>
-        <w:t>________________________________________________________________________________</w:t>
+        <w:tab/>
       </w:r>
     </w:p>
     <w:p>
       <w:pPr>
+        <w:tabs>
+          <w:tab w:pos="9751" w:val="right" w:leader="underscore"/>
+        </w:tabs>
         <w:spacing w:after="60"/>
       </w:pPr>
       <w:r>
-        <w:rPr>
-          <w:color w:val="94A3B8"/>
-          <w:sz w:val="18"/>
-        </w:rPr>
-        <w:t>________________________________________________________________________________</w:t>
+        <w:tab/>
       </w:r>
     </w:p>
     <w:p>
@@ -1744,19 +1780,22 @@
     </w:p>
     <w:tbl>
       <w:tblPr>
-        <w:tblW w:type="auto" w:w="0"/>
+        <w:tblW w:type="dxa" w:w="9751"/>
         <w:jc w:val="center"/>
         <w:tblLayout w:type="fixed"/>
         <w:tblLook w:firstColumn="1" w:firstRow="1" w:lastColumn="0" w:lastRow="0" w:noHBand="0" w:noVBand="1" w:val="04A0"/>
       </w:tblPr>
       <w:tblGrid>
-        <w:gridCol w:w="8050"/>
+        <w:gridCol w:w="7710"/>
         <w:gridCol w:w="2041"/>
       </w:tblGrid>
       <w:tr>
+        <w:trPr>
+          <w:cantSplit/>
+        </w:trPr>
         <w:tc>
           <w:tcPr>
-            <w:tcW w:type="dxa" w:w="8050"/>
+            <w:tcW w:type="dxa" w:w="7710"/>
             <w:tcMar>
               <w:top w:w="75" w:type="dxa"/>
               <w:start w:w="90" w:type="dxa"/>
@@ -1790,19 +1829,27 @@
             </w:tcBorders>
           </w:tcPr>
           <w:p>
+            <w:pPr>
+              <w:pBdr>
+                <w:bottom w:val="single" w:sz="6" w:space="1" w:color="94A3B8"/>
+              </w:pBdr>
+            </w:pPr>
             <w:r>
               <w:rPr>
-                <w:sz w:val="18"/>
+                <w:sz w:val="16"/>
               </w:rPr>
-              <w:t>________________</w:t>
+              <w:t xml:space="preserve"> </w:t>
             </w:r>
           </w:p>
         </w:tc>
       </w:tr>
       <w:tr>
+        <w:trPr>
+          <w:cantSplit/>
+        </w:trPr>
         <w:tc>
           <w:tcPr>
-            <w:tcW w:type="dxa" w:w="8050"/>
+            <w:tcW w:type="dxa" w:w="7710"/>
             <w:tcMar>
               <w:top w:w="75" w:type="dxa"/>
               <w:start w:w="90" w:type="dxa"/>
@@ -1836,19 +1883,27 @@
             </w:tcBorders>
           </w:tcPr>
           <w:p>
+            <w:pPr>
+              <w:pBdr>
+                <w:bottom w:val="single" w:sz="6" w:space="1" w:color="94A3B8"/>
+              </w:pBdr>
+            </w:pPr>
             <w:r>
               <w:rPr>
-                <w:sz w:val="18"/>
+                <w:sz w:val="16"/>
               </w:rPr>
-              <w:t>________________</w:t>
+              <w:t xml:space="preserve"> </w:t>
             </w:r>
           </w:p>
         </w:tc>
       </w:tr>
       <w:tr>
+        <w:trPr>
+          <w:cantSplit/>
+        </w:trPr>
         <w:tc>
           <w:tcPr>
-            <w:tcW w:type="dxa" w:w="8050"/>
+            <w:tcW w:type="dxa" w:w="7710"/>
             <w:tcMar>
               <w:top w:w="75" w:type="dxa"/>
               <w:start w:w="90" w:type="dxa"/>
@@ -1882,19 +1937,27 @@
             </w:tcBorders>
           </w:tcPr>
           <w:p>
+            <w:pPr>
+              <w:pBdr>
+                <w:bottom w:val="single" w:sz="6" w:space="1" w:color="94A3B8"/>
+              </w:pBdr>
+            </w:pPr>
             <w:r>
               <w:rPr>
-                <w:sz w:val="18"/>
+                <w:sz w:val="16"/>
               </w:rPr>
-              <w:t>________________</w:t>
+              <w:t xml:space="preserve"> </w:t>
             </w:r>
           </w:p>
         </w:tc>
       </w:tr>
       <w:tr>
+        <w:trPr>
+          <w:cantSplit/>
+        </w:trPr>
         <w:tc>
           <w:tcPr>
-            <w:tcW w:type="dxa" w:w="8050"/>
+            <w:tcW w:type="dxa" w:w="7710"/>
             <w:tcMar>
               <w:top w:w="75" w:type="dxa"/>
               <w:start w:w="90" w:type="dxa"/>
@@ -1928,19 +1991,27 @@
             </w:tcBorders>
           </w:tcPr>
           <w:p>
+            <w:pPr>
+              <w:pBdr>
+                <w:bottom w:val="single" w:sz="6" w:space="1" w:color="94A3B8"/>
+              </w:pBdr>
+            </w:pPr>
             <w:r>
               <w:rPr>
-                <w:sz w:val="18"/>
+                <w:sz w:val="16"/>
               </w:rPr>
-              <w:t>________________</w:t>
+              <w:t xml:space="preserve"> </w:t>
             </w:r>
           </w:p>
         </w:tc>
       </w:tr>
       <w:tr>
+        <w:trPr>
+          <w:cantSplit/>
+        </w:trPr>
         <w:tc>
           <w:tcPr>
-            <w:tcW w:type="dxa" w:w="8050"/>
+            <w:tcW w:type="dxa" w:w="7710"/>
             <w:tcMar>
               <w:top w:w="75" w:type="dxa"/>
               <w:start w:w="90" w:type="dxa"/>
@@ -1974,19 +2045,27 @@
             </w:tcBorders>
           </w:tcPr>
           <w:p>
+            <w:pPr>
+              <w:pBdr>
+                <w:bottom w:val="single" w:sz="6" w:space="1" w:color="94A3B8"/>
+              </w:pBdr>
+            </w:pPr>
             <w:r>
               <w:rPr>
-                <w:sz w:val="18"/>
+                <w:sz w:val="16"/>
               </w:rPr>
-              <w:t>________________</w:t>
+              <w:t xml:space="preserve"> </w:t>
             </w:r>
           </w:p>
         </w:tc>
       </w:tr>
       <w:tr>
+        <w:trPr>
+          <w:cantSplit/>
+        </w:trPr>
         <w:tc>
           <w:tcPr>
-            <w:tcW w:type="dxa" w:w="8050"/>
+            <w:tcW w:type="dxa" w:w="7710"/>
             <w:tcMar>
               <w:top w:w="75" w:type="dxa"/>
               <w:start w:w="90" w:type="dxa"/>
@@ -2020,11 +2099,16 @@
             </w:tcBorders>
           </w:tcPr>
           <w:p>
+            <w:pPr>
+              <w:pBdr>
+                <w:bottom w:val="single" w:sz="6" w:space="1" w:color="94A3B8"/>
+              </w:pBdr>
+            </w:pPr>
             <w:r>
               <w:rPr>
-                <w:sz w:val="18"/>
+                <w:sz w:val="16"/>
               </w:rPr>
-              <w:t>________________</w:t>
+              <w:t xml:space="preserve"> </w:t>
             </w:r>
           </w:p>
         </w:tc>
@@ -2144,14 +2228,13 @@
     </w:p>
     <w:p>
       <w:pPr>
+        <w:tabs>
+          <w:tab w:pos="9751" w:val="right" w:leader="underscore"/>
+        </w:tabs>
         <w:spacing w:after="60"/>
       </w:pPr>
       <w:r>
-        <w:rPr>
-          <w:color w:val="94A3B8"/>
-          <w:sz w:val="18"/>
-        </w:rPr>
-        <w:t>________________________________________________________________________________</w:t>
+        <w:tab/>
       </w:r>
     </w:p>
     <w:p>
@@ -2164,14 +2247,13 @@
     </w:p>
     <w:p>
       <w:pPr>
+        <w:tabs>
+          <w:tab w:pos="9751" w:val="right" w:leader="underscore"/>
+        </w:tabs>
         <w:spacing w:after="60"/>
       </w:pPr>
       <w:r>
-        <w:rPr>
-          <w:color w:val="94A3B8"/>
-          <w:sz w:val="18"/>
-        </w:rPr>
-        <w:t>________________________________________________________________________________</w:t>
+        <w:tab/>
       </w:r>
     </w:p>
     <w:p>
@@ -2208,19 +2290,22 @@
     </w:p>
     <w:tbl>
       <w:tblPr>
-        <w:tblW w:type="auto" w:w="0"/>
+        <w:tblW w:type="dxa" w:w="9751"/>
         <w:jc w:val="center"/>
         <w:tblLayout w:type="fixed"/>
         <w:tblLook w:firstColumn="1" w:firstRow="1" w:lastColumn="0" w:lastRow="0" w:noHBand="0" w:noVBand="1" w:val="04A0"/>
       </w:tblPr>
       <w:tblGrid>
-        <w:gridCol w:w="4932"/>
-        <w:gridCol w:w="4932"/>
+        <w:gridCol w:w="4876"/>
+        <w:gridCol w:w="4876"/>
       </w:tblGrid>
       <w:tr>
+        <w:trPr>
+          <w:cantSplit/>
+        </w:trPr>
         <w:tc>
           <w:tcPr>
-            <w:tcW w:type="dxa" w:w="5074"/>
+            <w:tcW w:type="dxa" w:w="4876"/>
             <w:shd w:fill="1D4ED8"/>
             <w:tcMar>
               <w:top w:w="90" w:type="dxa"/>
@@ -2245,7 +2330,7 @@
         </w:tc>
         <w:tc>
           <w:tcPr>
-            <w:tcW w:type="dxa" w:w="5074"/>
+            <w:tcW w:type="dxa" w:w="4876"/>
             <w:shd w:fill="15803D"/>
             <w:tcMar>
               <w:top w:w="90" w:type="dxa"/>
@@ -2270,9 +2355,12 @@
         </w:tc>
       </w:tr>
       <w:tr>
+        <w:trPr>
+          <w:cantSplit/>
+        </w:trPr>
         <w:tc>
           <w:tcPr>
-            <w:tcW w:type="dxa" w:w="5074"/>
+            <w:tcW w:type="dxa" w:w="4876"/>
             <w:shd w:fill="F8FAFC"/>
             <w:tcMar>
               <w:top w:w="120" w:type="dxa"/>
@@ -2302,7 +2390,7 @@
         </w:tc>
         <w:tc>
           <w:tcPr>
-            <w:tcW w:type="dxa" w:w="5074"/>
+            <w:tcW w:type="dxa" w:w="4876"/>
             <w:shd w:fill="F8FAFC"/>
             <w:tcMar>
               <w:top w:w="120" w:type="dxa"/>
@@ -2345,62 +2433,57 @@
     </w:p>
     <w:p>
       <w:pPr>
+        <w:tabs>
+          <w:tab w:pos="9751" w:val="right" w:leader="underscore"/>
+        </w:tabs>
         <w:spacing w:after="60"/>
       </w:pPr>
       <w:r>
-        <w:rPr>
-          <w:color w:val="94A3B8"/>
-          <w:sz w:val="18"/>
-        </w:rPr>
-        <w:t>________________________________________________________________________________</w:t>
+        <w:tab/>
       </w:r>
     </w:p>
     <w:p>
       <w:pPr>
+        <w:tabs>
+          <w:tab w:pos="9751" w:val="right" w:leader="underscore"/>
+        </w:tabs>
         <w:spacing w:after="60"/>
       </w:pPr>
       <w:r>
-        <w:rPr>
-          <w:color w:val="94A3B8"/>
-          <w:sz w:val="18"/>
-        </w:rPr>
-        <w:t>________________________________________________________________________________</w:t>
+        <w:tab/>
       </w:r>
     </w:p>
     <w:p>
       <w:pPr>
+        <w:tabs>
+          <w:tab w:pos="9751" w:val="right" w:leader="underscore"/>
+        </w:tabs>
         <w:spacing w:after="60"/>
       </w:pPr>
       <w:r>
-        <w:rPr>
-          <w:color w:val="94A3B8"/>
-          <w:sz w:val="18"/>
-        </w:rPr>
-        <w:t>________________________________________________________________________________</w:t>
+        <w:tab/>
       </w:r>
     </w:p>
     <w:p>
       <w:pPr>
+        <w:tabs>
+          <w:tab w:pos="9751" w:val="right" w:leader="underscore"/>
+        </w:tabs>
         <w:spacing w:after="60"/>
       </w:pPr>
       <w:r>
-        <w:rPr>
-          <w:color w:val="94A3B8"/>
-          <w:sz w:val="18"/>
-        </w:rPr>
-        <w:t>________________________________________________________________________________</w:t>
+        <w:tab/>
       </w:r>
     </w:p>
     <w:p>
       <w:pPr>
+        <w:tabs>
+          <w:tab w:pos="9751" w:val="right" w:leader="underscore"/>
+        </w:tabs>
         <w:spacing w:after="60"/>
       </w:pPr>
       <w:r>
-        <w:rPr>
-          <w:color w:val="94A3B8"/>
-          <w:sz w:val="18"/>
-        </w:rPr>
-        <w:t>________________________________________________________________________________</w:t>
+        <w:tab/>
       </w:r>
     </w:p>
     <w:p>
@@ -2446,19 +2529,22 @@
     </w:p>
     <w:tbl>
       <w:tblPr>
-        <w:tblW w:type="auto" w:w="0"/>
+        <w:tblW w:type="dxa" w:w="9751"/>
         <w:jc w:val="left"/>
         <w:tblLayout w:type="fixed"/>
         <w:tblLook w:firstColumn="1" w:firstRow="1" w:lastColumn="0" w:lastRow="0" w:noHBand="0" w:noVBand="1" w:val="04A0"/>
       </w:tblPr>
       <w:tblGrid>
-        <w:gridCol w:w="5046"/>
-        <w:gridCol w:w="5046"/>
+        <w:gridCol w:w="4876"/>
+        <w:gridCol w:w="4876"/>
       </w:tblGrid>
       <w:tr>
+        <w:trPr>
+          <w:cantSplit/>
+        </w:trPr>
         <w:tc>
           <w:tcPr>
-            <w:tcW w:type="dxa" w:w="5046"/>
+            <w:tcW w:type="dxa" w:w="4876"/>
             <w:tcMar>
               <w:top w:w="55" w:type="dxa"/>
               <w:start w:w="60" w:type="dxa"/>
@@ -2480,7 +2566,7 @@
         </w:tc>
         <w:tc>
           <w:tcPr>
-            <w:tcW w:type="dxa" w:w="5046"/>
+            <w:tcW w:type="dxa" w:w="4876"/>
             <w:tcMar>
               <w:top w:w="55" w:type="dxa"/>
               <w:start w:w="60" w:type="dxa"/>
@@ -2502,9 +2588,12 @@
         </w:tc>
       </w:tr>
       <w:tr>
+        <w:trPr>
+          <w:cantSplit/>
+        </w:trPr>
         <w:tc>
           <w:tcPr>
-            <w:tcW w:type="dxa" w:w="5046"/>
+            <w:tcW w:type="dxa" w:w="4876"/>
             <w:tcMar>
               <w:top w:w="55" w:type="dxa"/>
               <w:start w:w="60" w:type="dxa"/>
@@ -2526,7 +2615,7 @@
         </w:tc>
         <w:tc>
           <w:tcPr>
-            <w:tcW w:type="dxa" w:w="5046"/>
+            <w:tcW w:type="dxa" w:w="4876"/>
             <w:tcMar>
               <w:top w:w="55" w:type="dxa"/>
               <w:start w:w="60" w:type="dxa"/>
@@ -2548,9 +2637,12 @@
         </w:tc>
       </w:tr>
       <w:tr>
+        <w:trPr>
+          <w:cantSplit/>
+        </w:trPr>
         <w:tc>
           <w:tcPr>
-            <w:tcW w:type="dxa" w:w="5046"/>
+            <w:tcW w:type="dxa" w:w="4876"/>
             <w:tcMar>
               <w:top w:w="55" w:type="dxa"/>
               <w:start w:w="60" w:type="dxa"/>
@@ -2572,7 +2664,7 @@
         </w:tc>
         <w:tc>
           <w:tcPr>
-            <w:tcW w:type="dxa" w:w="5046"/>
+            <w:tcW w:type="dxa" w:w="4876"/>
             <w:tcMar>
               <w:top w:w="55" w:type="dxa"/>
               <w:start w:w="60" w:type="dxa"/>
@@ -2605,19 +2697,22 @@
     </w:p>
     <w:tbl>
       <w:tblPr>
-        <w:tblW w:type="auto" w:w="0"/>
+        <w:tblW w:type="dxa" w:w="9751"/>
         <w:jc w:val="left"/>
         <w:tblLayout w:type="fixed"/>
         <w:tblLook w:firstColumn="1" w:firstRow="1" w:lastColumn="0" w:lastRow="0" w:noHBand="0" w:noVBand="1" w:val="04A0"/>
       </w:tblPr>
       <w:tblGrid>
-        <w:gridCol w:w="5046"/>
-        <w:gridCol w:w="5046"/>
+        <w:gridCol w:w="4876"/>
+        <w:gridCol w:w="4876"/>
       </w:tblGrid>
       <w:tr>
+        <w:trPr>
+          <w:cantSplit/>
+        </w:trPr>
         <w:tc>
           <w:tcPr>
-            <w:tcW w:type="dxa" w:w="5046"/>
+            <w:tcW w:type="dxa" w:w="4876"/>
             <w:tcMar>
               <w:top w:w="55" w:type="dxa"/>
               <w:start w:w="60" w:type="dxa"/>
@@ -2639,7 +2734,7 @@
         </w:tc>
         <w:tc>
           <w:tcPr>
-            <w:tcW w:type="dxa" w:w="5046"/>
+            <w:tcW w:type="dxa" w:w="4876"/>
             <w:tcMar>
               <w:top w:w="55" w:type="dxa"/>
               <w:start w:w="60" w:type="dxa"/>
@@ -2661,9 +2756,12 @@
         </w:tc>
       </w:tr>
       <w:tr>
+        <w:trPr>
+          <w:cantSplit/>
+        </w:trPr>
         <w:tc>
           <w:tcPr>
-            <w:tcW w:type="dxa" w:w="5046"/>
+            <w:tcW w:type="dxa" w:w="4876"/>
             <w:tcMar>
               <w:top w:w="55" w:type="dxa"/>
               <w:start w:w="60" w:type="dxa"/>
@@ -2685,7 +2783,7 @@
         </w:tc>
         <w:tc>
           <w:tcPr>
-            <w:tcW w:type="dxa" w:w="5046"/>
+            <w:tcW w:type="dxa" w:w="4876"/>
             <w:tcMar>
               <w:top w:w="55" w:type="dxa"/>
               <w:start w:w="60" w:type="dxa"/>
@@ -2707,9 +2805,12 @@
         </w:tc>
       </w:tr>
       <w:tr>
+        <w:trPr>
+          <w:cantSplit/>
+        </w:trPr>
         <w:tc>
           <w:tcPr>
-            <w:tcW w:type="dxa" w:w="5046"/>
+            <w:tcW w:type="dxa" w:w="4876"/>
             <w:tcMar>
               <w:top w:w="55" w:type="dxa"/>
               <w:start w:w="60" w:type="dxa"/>
@@ -2731,7 +2832,7 @@
         </w:tc>
         <w:tc>
           <w:tcPr>
-            <w:tcW w:type="dxa" w:w="5046"/>
+            <w:tcW w:type="dxa" w:w="4876"/>
             <w:tcMar>
               <w:top w:w="55" w:type="dxa"/>
               <w:start w:w="60" w:type="dxa"/>
@@ -2764,19 +2865,22 @@
     </w:p>
     <w:tbl>
       <w:tblPr>
-        <w:tblW w:type="auto" w:w="0"/>
+        <w:tblW w:type="dxa" w:w="9751"/>
         <w:jc w:val="left"/>
         <w:tblLayout w:type="fixed"/>
         <w:tblLook w:firstColumn="1" w:firstRow="1" w:lastColumn="0" w:lastRow="0" w:noHBand="0" w:noVBand="1" w:val="04A0"/>
       </w:tblPr>
       <w:tblGrid>
-        <w:gridCol w:w="5046"/>
-        <w:gridCol w:w="5046"/>
+        <w:gridCol w:w="4876"/>
+        <w:gridCol w:w="4876"/>
       </w:tblGrid>
       <w:tr>
+        <w:trPr>
+          <w:cantSplit/>
+        </w:trPr>
         <w:tc>
           <w:tcPr>
-            <w:tcW w:type="dxa" w:w="5046"/>
+            <w:tcW w:type="dxa" w:w="4876"/>
             <w:tcMar>
               <w:top w:w="55" w:type="dxa"/>
               <w:start w:w="60" w:type="dxa"/>
@@ -2798,7 +2902,7 @@
         </w:tc>
         <w:tc>
           <w:tcPr>
-            <w:tcW w:type="dxa" w:w="5046"/>
+            <w:tcW w:type="dxa" w:w="4876"/>
             <w:tcMar>
               <w:top w:w="55" w:type="dxa"/>
               <w:start w:w="60" w:type="dxa"/>
@@ -2820,9 +2924,12 @@
         </w:tc>
       </w:tr>
       <w:tr>
+        <w:trPr>
+          <w:cantSplit/>
+        </w:trPr>
         <w:tc>
           <w:tcPr>
-            <w:tcW w:type="dxa" w:w="5046"/>
+            <w:tcW w:type="dxa" w:w="4876"/>
             <w:tcMar>
               <w:top w:w="55" w:type="dxa"/>
               <w:start w:w="60" w:type="dxa"/>
@@ -2844,7 +2951,7 @@
         </w:tc>
         <w:tc>
           <w:tcPr>
-            <w:tcW w:type="dxa" w:w="5046"/>
+            <w:tcW w:type="dxa" w:w="4876"/>
             <w:tcMar>
               <w:top w:w="55" w:type="dxa"/>
               <w:start w:w="60" w:type="dxa"/>
@@ -2866,9 +2973,12 @@
         </w:tc>
       </w:tr>
       <w:tr>
+        <w:trPr>
+          <w:cantSplit/>
+        </w:trPr>
         <w:tc>
           <w:tcPr>
-            <w:tcW w:type="dxa" w:w="5046"/>
+            <w:tcW w:type="dxa" w:w="4876"/>
             <w:tcMar>
               <w:top w:w="55" w:type="dxa"/>
               <w:start w:w="60" w:type="dxa"/>
@@ -2890,7 +3000,7 @@
         </w:tc>
         <w:tc>
           <w:tcPr>
-            <w:tcW w:type="dxa" w:w="5046"/>
+            <w:tcW w:type="dxa" w:w="4876"/>
             <w:tcMar>
               <w:top w:w="55" w:type="dxa"/>
               <w:start w:w="60" w:type="dxa"/>
@@ -2913,14 +3023,10 @@
       </w:tr>
     </w:tbl>
     <w:p>
-      <w:r>
-        <w:br w:type="page"/>
-      </w:r>
-    </w:p>
-    <w:p>
       <w:pPr>
         <w:pStyle w:val="Heading1"/>
         <w:keepNext w:val="1"/>
+        <w:pageBreakBefore/>
       </w:pPr>
       <w:r>
         <w:rPr>
@@ -2978,62 +3084,57 @@
     </w:p>
     <w:p>
       <w:pPr>
+        <w:tabs>
+          <w:tab w:pos="9751" w:val="right" w:leader="underscore"/>
+        </w:tabs>
         <w:spacing w:after="60"/>
       </w:pPr>
       <w:r>
-        <w:rPr>
-          <w:color w:val="94A3B8"/>
-          <w:sz w:val="18"/>
-        </w:rPr>
-        <w:t>________________________________________________________________________________</w:t>
+        <w:tab/>
       </w:r>
     </w:p>
     <w:p>
       <w:pPr>
+        <w:tabs>
+          <w:tab w:pos="9751" w:val="right" w:leader="underscore"/>
+        </w:tabs>
         <w:spacing w:after="60"/>
       </w:pPr>
       <w:r>
-        <w:rPr>
-          <w:color w:val="94A3B8"/>
-          <w:sz w:val="18"/>
-        </w:rPr>
-        <w:t>________________________________________________________________________________</w:t>
+        <w:tab/>
       </w:r>
     </w:p>
     <w:p>
       <w:pPr>
+        <w:tabs>
+          <w:tab w:pos="9751" w:val="right" w:leader="underscore"/>
+        </w:tabs>
         <w:spacing w:after="60"/>
       </w:pPr>
       <w:r>
-        <w:rPr>
-          <w:color w:val="94A3B8"/>
-          <w:sz w:val="18"/>
-        </w:rPr>
-        <w:t>________________________________________________________________________________</w:t>
+        <w:tab/>
       </w:r>
     </w:p>
     <w:p>
       <w:pPr>
+        <w:tabs>
+          <w:tab w:pos="9751" w:val="right" w:leader="underscore"/>
+        </w:tabs>
         <w:spacing w:after="60"/>
       </w:pPr>
       <w:r>
-        <w:rPr>
-          <w:color w:val="94A3B8"/>
-          <w:sz w:val="18"/>
-        </w:rPr>
-        <w:t>________________________________________________________________________________</w:t>
+        <w:tab/>
       </w:r>
     </w:p>
     <w:p>
       <w:pPr>
+        <w:tabs>
+          <w:tab w:pos="9751" w:val="right" w:leader="underscore"/>
+        </w:tabs>
         <w:spacing w:after="60"/>
       </w:pPr>
       <w:r>
-        <w:rPr>
-          <w:color w:val="94A3B8"/>
-          <w:sz w:val="18"/>
-        </w:rPr>
-        <w:t>________________________________________________________________________________</w:t>
+        <w:tab/>
       </w:r>
     </w:p>
     <w:p>
@@ -3046,38 +3147,35 @@
     </w:p>
     <w:p>
       <w:pPr>
+        <w:tabs>
+          <w:tab w:pos="9751" w:val="right" w:leader="underscore"/>
+        </w:tabs>
         <w:spacing w:after="60"/>
       </w:pPr>
       <w:r>
-        <w:rPr>
-          <w:color w:val="94A3B8"/>
-          <w:sz w:val="18"/>
-        </w:rPr>
-        <w:t>________________________________________________________________________________</w:t>
+        <w:tab/>
       </w:r>
     </w:p>
     <w:p>
       <w:pPr>
+        <w:tabs>
+          <w:tab w:pos="9751" w:val="right" w:leader="underscore"/>
+        </w:tabs>
         <w:spacing w:after="60"/>
       </w:pPr>
       <w:r>
-        <w:rPr>
-          <w:color w:val="94A3B8"/>
-          <w:sz w:val="18"/>
-        </w:rPr>
-        <w:t>________________________________________________________________________________</w:t>
+        <w:tab/>
       </w:r>
     </w:p>
     <w:p>
       <w:pPr>
+        <w:tabs>
+          <w:tab w:pos="9751" w:val="right" w:leader="underscore"/>
+        </w:tabs>
         <w:spacing w:after="60"/>
       </w:pPr>
       <w:r>
-        <w:rPr>
-          <w:color w:val="94A3B8"/>
-          <w:sz w:val="18"/>
-        </w:rPr>
-        <w:t>________________________________________________________________________________</w:t>
+        <w:tab/>
       </w:r>
     </w:p>
     <w:p>
@@ -3185,30 +3283,24 @@
     </w:p>
     <w:p>
       <w:pPr>
+        <w:tabs>
+          <w:tab w:pos="9751" w:val="right" w:leader="underscore"/>
+        </w:tabs>
         <w:spacing w:before="0" w:after="60"/>
       </w:pPr>
       <w:r>
-        <w:rPr>
-          <w:rFonts w:ascii="Arial" w:hAnsi="Arial"/>
-          <w:b w:val="0"/>
-          <w:color w:val="94A3B8"/>
-          <w:sz w:val="18"/>
-        </w:rPr>
-        <w:t>________________________________________________________________________________</w:t>
+        <w:tab/>
       </w:r>
     </w:p>
     <w:p>
       <w:pPr>
+        <w:tabs>
+          <w:tab w:pos="9751" w:val="right" w:leader="underscore"/>
+        </w:tabs>
         <w:spacing w:before="0" w:after="60"/>
       </w:pPr>
       <w:r>
-        <w:rPr>
-          <w:rFonts w:ascii="Arial" w:hAnsi="Arial"/>
-          <w:b w:val="0"/>
-          <w:color w:val="94A3B8"/>
-          <w:sz w:val="18"/>
-        </w:rPr>
-        <w:t>________________________________________________________________________________</w:t>
+        <w:tab/>
       </w:r>
     </w:p>
     <w:p>
@@ -3255,30 +3347,24 @@
     </w:p>
     <w:p>
       <w:pPr>
+        <w:tabs>
+          <w:tab w:pos="9751" w:val="right" w:leader="underscore"/>
+        </w:tabs>
         <w:spacing w:before="0" w:after="60"/>
       </w:pPr>
       <w:r>
-        <w:rPr>
-          <w:rFonts w:ascii="Arial" w:hAnsi="Arial"/>
-          <w:b w:val="0"/>
-          <w:color w:val="94A3B8"/>
-          <w:sz w:val="18"/>
-        </w:rPr>
-        <w:t>________________________________________________________________________________</w:t>
+        <w:tab/>
       </w:r>
     </w:p>
     <w:p>
       <w:pPr>
+        <w:tabs>
+          <w:tab w:pos="9751" w:val="right" w:leader="underscore"/>
+        </w:tabs>
         <w:spacing w:before="0" w:after="60"/>
       </w:pPr>
       <w:r>
-        <w:rPr>
-          <w:rFonts w:ascii="Arial" w:hAnsi="Arial"/>
-          <w:b w:val="0"/>
-          <w:color w:val="94A3B8"/>
-          <w:sz w:val="18"/>
-        </w:rPr>
-        <w:t>________________________________________________________________________________</w:t>
+        <w:tab/>
       </w:r>
     </w:p>
     <w:p>

</xml_diff>